<commit_message>
Guida magazzino: formato compatto su 2 facciate
4 sezioni (era 7), niente salti pagina, senza frontespizio.
Carico e rettifica unificati, movimenti e allarmi unificati.

Co-Authored-By: Claude Sonnet 4.6 <noreply@anthropic.com>
</commit_message>
<xml_diff>
--- a/guide/Guida_Rapida_Magazzino.docx
+++ b/guide/Guida_Rapida_Magazzino.docx
@@ -4,57 +4,7 @@
   <w:body>
     <w:p>
       <w:pPr>
-        <w:spacing w:before="2000"/>
-      </w:pPr>
-    </w:p>
-    <w:p>
-      <w:pPr>
-        <w:spacing w:after="200"/>
-        <w:jc w:val="center"/>
-      </w:pPr>
-      <w:r>
-        <w:rPr>
-          <w:b/>
-          <w:color w:val="1A5276"/>
-          <w:sz w:val="72"/>
-        </w:rPr>
-        <w:t>CASSA DALILA</w:t>
-      </w:r>
-    </w:p>
-    <w:p>
-      <w:pPr>
-        <w:spacing w:after="600"/>
-        <w:jc w:val="center"/>
-      </w:pPr>
-      <w:r>
-        <w:rPr>
-          <w:i/>
-          <w:color w:val="666666"/>
-          <w:sz w:val="36"/>
-        </w:rPr>
-        <w:t>Gestione magazzino</w:t>
-      </w:r>
-    </w:p>
-    <w:p>
-      <w:pPr>
-        <w:pBdr>
-          <w:bottom w:val="single" w:sz="8" w:space="1" w:color="D97706"/>
-        </w:pBdr>
-        <w:spacing w:after="600"/>
-        <w:jc w:val="center"/>
-      </w:pPr>
-      <w:r>
-        <w:rPr>
-          <w:sz w:val="24"/>
-          <w:szCs w:val="24"/>
-        </w:rPr>
-        <w:t xml:space="preserve"> </w:t>
-      </w:r>
-    </w:p>
-    <w:p>
-      <w:pPr>
-        <w:spacing w:before="600" w:after="120"/>
-        <w:jc w:val="center"/>
+        <w:spacing w:before="0" w:after="60"/>
       </w:pPr>
       <w:r>
         <w:rPr>
@@ -62,58 +12,33 @@
           <w:color w:val="1A5276"/>
           <w:sz w:val="36"/>
         </w:rPr>
-        <w:t>GUIDA RAPIDA</w:t>
-      </w:r>
-    </w:p>
-    <w:p>
-      <w:pPr>
-        <w:spacing w:after="2000"/>
-        <w:jc w:val="center"/>
+        <w:t>GUIDA RAPIDA — GESTIONE MAGAZZINO</w:t>
+      </w:r>
+    </w:p>
+    <w:p>
+      <w:pPr>
+        <w:spacing w:before="0" w:after="200"/>
       </w:pPr>
       <w:r>
         <w:rPr>
           <w:color w:val="666666"/>
-          <w:sz w:val="24"/>
+          <w:sz w:val="20"/>
         </w:rPr>
-        <w:t>Carico, rettifica e controllo scorte</w:t>
-      </w:r>
-    </w:p>
-    <w:p>
-      <w:pPr>
-        <w:spacing w:after="120"/>
-        <w:jc w:val="center"/>
-      </w:pPr>
-      <w:r>
-        <w:rPr>
-          <w:color w:val="666666"/>
-        </w:rPr>
-        <w:t>v1.4  |  2026</w:t>
-      </w:r>
-    </w:p>
-    <w:p>
-      <w:r>
-        <w:br w:type="page"/>
-      </w:r>
-    </w:p>
-    <w:p>
-      <w:pPr>
-        <w:sectPr>
-          <w:headerReference w:type="default" r:id="rId11"/>
-          <w:footerReference w:type="default" r:id="rId12"/>
-          <w:headerReference w:type="even" r:id="rId13"/>
-          <w:footerReference w:type="even" r:id="rId14"/>
-          <w:headerReference w:type="first" r:id="rId15"/>
-          <w:footerReference w:type="first" r:id="rId16"/>
-          <w:pgSz w:w="11906" w:h="16838"/>
-          <w:pgMar w:top="1440" w:right="1440" w:bottom="1440" w:left="1440" w:header="708" w:footer="708" w:gutter="0"/>
-          <w:cols w:space="720"/>
-          <w:docGrid w:linePitch="360"/>
-        </w:sectPr>
-      </w:pPr>
-    </w:p>
+        <w:t>Cassa Dalila v1.4  ·  Oratorio Dalila</w:t>
+      </w:r>
+    </w:p>
+    <w:sectPr>
+      <w:headerReference w:type="default" r:id="rId7"/>
+      <w:footerReference w:type="default" r:id="rId8"/>
+      <w:pgSz w:w="11906" w:h="16838"/>
+      <w:pgMar w:top="1200" w:right="1200" w:bottom="1200" w:left="1440" w:header="708" w:footer="708" w:gutter="0"/>
+      <w:cols w:space="720"/>
+      <w:docGrid w:linePitch="360"/>
+    </w:sectPr>
     <w:p>
       <w:pPr>
         <w:pStyle w:val="Heading10"/>
+        <w:spacing w:before="160" w:after="60"/>
       </w:pPr>
       <w:r>
         <w:t>1. Come funziona il magazzino</w:t>
@@ -121,10 +46,10 @@
     </w:p>
     <w:p>
       <w:pPr>
-        <w:spacing w:after="120"/>
-      </w:pPr>
-      <w:r>
-        <w:t>Il magazzino di Cassa Dalila è collegato direttamente alle vendite: ogni scontrino emesso scarica automaticamente le scorte dei prodotti venduti.</w:t>
+        <w:spacing w:after="80"/>
+      </w:pPr>
+      <w:r>
+        <w:t>Le scorte si aggiornano automaticamente ad ogni scontrino. La pagina Magazzino ha tre schede: Magazzini comuni, Prodotti singoli, Movimenti.</w:t>
       </w:r>
     </w:p>
     <w:tbl>
@@ -226,7 +151,7 @@
           </w:tcPr>
           <w:p>
             <w:r>
-              <w:t>Scarico automatico di ogni prodotto venduto</w:t>
+              <w:t>Scarico automatico dei prodotti venduti</w:t>
             </w:r>
           </w:p>
         </w:tc>
@@ -248,7 +173,7 @@
           </w:tcPr>
           <w:p>
             <w:r>
-              <w:t>Carico automatico (le scorte tornano disponibili)</w:t>
+              <w:t>Carico automatico (scorte ripristinate)</w:t>
             </w:r>
           </w:p>
         </w:tc>
@@ -282,7 +207,7 @@
           </w:tcPr>
           <w:p>
             <w:r>
-              <w:t>Carico manuale</w:t>
+              <w:t>Carico manuale (+)</w:t>
             </w:r>
           </w:p>
         </w:tc>
@@ -292,7 +217,7 @@
           </w:tcPr>
           <w:p>
             <w:r>
-              <w:t>Aggiunge la quantità inserita alla scorta attuale</w:t>
+              <w:t>Aggiunge alla scorta attuale</w:t>
             </w:r>
           </w:p>
         </w:tc>
@@ -304,7 +229,7 @@
           </w:tcPr>
           <w:p>
             <w:r>
-              <w:t>Rettifica manuale</w:t>
+              <w:t>Rettifica (=)</w:t>
             </w:r>
           </w:p>
         </w:tc>
@@ -314,7 +239,7 @@
           </w:tcPr>
           <w:p>
             <w:r>
-              <w:t>Imposta la scorta al valore esatto inserito</w:t>
+              <w:t>Imposta la scorta al valore esatto</w:t>
             </w:r>
           </w:p>
         </w:tc>
@@ -337,190 +262,28 @@
         <w:t xml:space="preserve">Nota: </w:t>
       </w:r>
       <w:r>
-        <w:t>I prodotti con scorta impostata a -1 hanno scorta illimitata e non vengono scalati.</w:t>
-      </w:r>
-    </w:p>
-    <w:p>
-      <w:r>
-        <w:br w:type="page"/>
+        <w:t>Scorta -1 = illimitata, non viene scalata dalle vendite.</w:t>
       </w:r>
     </w:p>
     <w:p>
       <w:pPr>
         <w:pStyle w:val="Heading10"/>
-      </w:pPr>
-      <w:r>
-        <w:t>2. Le tre schede della pagina Magazzino</w:t>
-      </w:r>
-    </w:p>
-    <w:tbl>
-      <w:tblPr>
-        <w:tblW w:w="9360" w:type="dxa"/>
-        <w:tblInd w:w="130" w:type="dxa"/>
-        <w:tblBorders>
-          <w:top w:val="single" w:sz="4" w:space="0" w:color="auto"/>
-          <w:left w:val="single" w:sz="4" w:space="0" w:color="auto"/>
-          <w:bottom w:val="single" w:sz="4" w:space="0" w:color="auto"/>
-          <w:right w:val="single" w:sz="4" w:space="0" w:color="auto"/>
-          <w:insideH w:val="single" w:sz="4" w:space="0" w:color="auto"/>
-          <w:insideV w:val="single" w:sz="4" w:space="0" w:color="auto"/>
-        </w:tblBorders>
-        <w:tblCellMar>
-          <w:left w:w="10" w:type="dxa"/>
-          <w:right w:w="10" w:type="dxa"/>
-        </w:tblCellMar>
-        <w:tblLook w:val="04A0"/>
-      </w:tblPr>
-      <w:tblGrid>
-        <w:gridCol w:w="3500"/>
-        <w:gridCol w:w="5860"/>
-      </w:tblGrid>
-      <w:tr>
-        <w:tblPrEx>
-          <w:tblCellMar>
-            <w:top w:w="0" w:type="dxa"/>
-            <w:bottom w:w="0" w:type="dxa"/>
-          </w:tblCellMar>
-        </w:tblPrEx>
-        <w:tc>
-          <w:tcPr>
-            <w:tcW w:w="3500" w:type="dxa"/>
-            <w:tcBorders>
-              <w:top w:val="single" w:sz="1" w:space="0" w:color="CCCCCC"/>
-              <w:left w:val="single" w:sz="1" w:space="0" w:color="CCCCCC"/>
-              <w:bottom w:val="single" w:sz="1" w:space="0" w:color="CCCCCC"/>
-              <w:right w:val="single" w:sz="1" w:space="0" w:color="CCCCCC"/>
-            </w:tcBorders>
-            <w:shd w:val="clear" w:color="auto" w:fill="F5F5F5"/>
-            <w:tcMar>
-              <w:top w:w="80" w:type="dxa"/>
-              <w:left w:w="140" w:type="dxa"/>
-              <w:bottom w:w="80" w:type="dxa"/>
-              <w:right w:w="140" w:type="dxa"/>
-            </w:tcMar>
-          </w:tcPr>
-          <w:p>
-            <w:r>
-              <w:rPr>
-                <w:b/>
-              </w:rPr>
-              <w:t>Scheda</w:t>
-            </w:r>
-          </w:p>
-        </w:tc>
-        <w:tc>
-          <w:tcPr>
-            <w:tcW w:w="5860" w:type="dxa"/>
-            <w:tcBorders>
-              <w:top w:val="single" w:sz="1" w:space="0" w:color="CCCCCC"/>
-              <w:left w:val="single" w:sz="1" w:space="0" w:color="CCCCCC"/>
-              <w:bottom w:val="single" w:sz="1" w:space="0" w:color="CCCCCC"/>
-              <w:right w:val="single" w:sz="1" w:space="0" w:color="CCCCCC"/>
-            </w:tcBorders>
-            <w:shd w:val="clear" w:color="auto" w:fill="F5F5F5"/>
-            <w:tcMar>
-              <w:top w:w="80" w:type="dxa"/>
-              <w:left w:w="140" w:type="dxa"/>
-              <w:bottom w:w="80" w:type="dxa"/>
-              <w:right w:w="140" w:type="dxa"/>
-            </w:tcMar>
-          </w:tcPr>
-          <w:p>
-            <w:r>
-              <w:rPr>
-                <w:b/>
-              </w:rPr>
-              <w:t>Contenuto</w:t>
-            </w:r>
-          </w:p>
-        </w:tc>
-      </w:tr>
-      <w:tr>
-        <w:tc>
-          <w:tcPr>
-            <w:tcW w:type="dxa" w:w="3500"/>
-          </w:tcPr>
-          <w:p>
-            <w:r>
-              <w:t>Magazzini comuni</w:t>
-            </w:r>
-          </w:p>
-        </w:tc>
-        <w:tc>
-          <w:tcPr>
-            <w:tcW w:type="dxa" w:w="5860"/>
-          </w:tcPr>
-          <w:p>
-            <w:r>
-              <w:t>Stock condivisi tra più prodotti (es. panini usati da più tipi di hamburger)</w:t>
-            </w:r>
-          </w:p>
-        </w:tc>
-      </w:tr>
-      <w:tr>
-        <w:tc>
-          <w:tcPr>
-            <w:tcW w:type="dxa" w:w="3500"/>
-          </w:tcPr>
-          <w:p>
-            <w:r>
-              <w:t>Prodotti singoli</w:t>
-            </w:r>
-          </w:p>
-        </w:tc>
-        <w:tc>
-          <w:tcPr>
-            <w:tcW w:type="dxa" w:w="5860"/>
-          </w:tcPr>
-          <w:p>
-            <w:r>
-              <w:t>Prodotti con scorta propria, non collegati a un magazzino comune</w:t>
-            </w:r>
-          </w:p>
-        </w:tc>
-      </w:tr>
-      <w:tr>
-        <w:tc>
-          <w:tcPr>
-            <w:tcW w:type="dxa" w:w="3500"/>
-          </w:tcPr>
-          <w:p>
-            <w:r>
-              <w:t>Movimenti</w:t>
-            </w:r>
-          </w:p>
-        </w:tc>
-        <w:tc>
-          <w:tcPr>
-            <w:tcW w:type="dxa" w:w="5860"/>
-          </w:tcPr>
-          <w:p>
-            <w:r>
-              <w:t>Registro cronologico di tutte le variazioni: scarichi da vendita, carichi manuali, rettifiche</w:t>
-            </w:r>
-          </w:p>
-        </w:tc>
-      </w:tr>
-    </w:tbl>
-    <w:p>
-      <w:r>
-        <w:br w:type="page"/>
-      </w:r>
-    </w:p>
-    <w:p>
-      <w:pPr>
-        <w:pStyle w:val="Heading10"/>
-      </w:pPr>
-      <w:r>
-        <w:t>3. Caricare merce ricevuta (Carico +)</w:t>
-      </w:r>
-    </w:p>
-    <w:p>
-      <w:pPr>
-        <w:spacing w:after="120"/>
-      </w:pPr>
-      <w:r>
-        <w:t>Usa il carico quando ricevi nuova merce e vuoi aggiungere quantità alla scorta attuale.</w:t>
+        <w:spacing w:before="160" w:after="60"/>
+      </w:pPr>
+      <w:r>
+        <w:t>2. Carico e rettifica</w:t>
+      </w:r>
+    </w:p>
+    <w:p>
+      <w:pPr>
+        <w:pStyle w:val="Heading20"/>
+        <w:pBdr>
+          <w:bottom w:val="single" w:sz="4" w:space="4" w:color="D97706"/>
+        </w:pBdr>
+        <w:spacing w:before="100" w:after="40"/>
+      </w:pPr>
+      <w:r>
+        <w:t>Carico + (merce ricevuta)</w:t>
       </w:r>
     </w:p>
     <w:p>
@@ -530,10 +293,10 @@
           <w:ilvl w:val="0"/>
           <w:numId w:val="3"/>
         </w:numPr>
-        <w:spacing w:before="40" w:after="40"/>
-      </w:pPr>
-      <w:r>
-        <w:t>Vai in Magazzino</w:t>
+        <w:spacing w:before="20" w:after="20"/>
+      </w:pPr>
+      <w:r>
+        <w:t>Magazzino → trova prodotto o magazzino comune → Carico (+)</w:t>
       </w:r>
     </w:p>
     <w:p>
@@ -543,70 +306,18 @@
           <w:ilvl w:val="0"/>
           <w:numId w:val="3"/>
         </w:numPr>
-        <w:spacing w:before="40" w:after="40"/>
-      </w:pPr>
-      <w:r>
-        <w:t>Trova il prodotto (o magazzino comune) da ricaricare</w:t>
-      </w:r>
-    </w:p>
-    <w:p>
-      <w:pPr>
-        <w:pStyle w:val="Paragrafoelenco"/>
-        <w:numPr>
-          <w:ilvl w:val="0"/>
-          <w:numId w:val="3"/>
-        </w:numPr>
-        <w:spacing w:before="40" w:after="40"/>
-      </w:pPr>
-      <w:r>
-        <w:t>Clicca il pulsante Carico (+)</w:t>
-      </w:r>
-    </w:p>
-    <w:p>
-      <w:pPr>
-        <w:pStyle w:val="Paragrafoelenco"/>
-        <w:numPr>
-          <w:ilvl w:val="0"/>
-          <w:numId w:val="3"/>
-        </w:numPr>
-        <w:spacing w:before="40" w:after="40"/>
-      </w:pPr>
-      <w:r>
-        <w:t>Inserisci la quantità ricevuta (es. 50)</w:t>
-      </w:r>
-    </w:p>
-    <w:p>
-      <w:pPr>
-        <w:pStyle w:val="Paragrafoelenco"/>
-        <w:numPr>
-          <w:ilvl w:val="0"/>
-          <w:numId w:val="3"/>
-        </w:numPr>
-        <w:spacing w:before="40" w:after="40"/>
-      </w:pPr>
-      <w:r>
-        <w:t>Aggiungi una nota opzionale (es. "Carico serata 15 maggio")</w:t>
-      </w:r>
-    </w:p>
-    <w:p>
-      <w:pPr>
-        <w:pStyle w:val="Paragrafoelenco"/>
-        <w:numPr>
-          <w:ilvl w:val="0"/>
-          <w:numId w:val="3"/>
-        </w:numPr>
-        <w:spacing w:before="40" w:after="40"/>
-      </w:pPr>
-      <w:r>
-        <w:t>Clicca Salva</w:t>
-      </w:r>
-    </w:p>
-    <w:p>
-      <w:pPr>
-        <w:spacing w:after="120"/>
-      </w:pPr>
-      <w:r>
-        <w:t>La nuova scorta sarà: scorta precedente + quantità inserita.</w:t>
+        <w:spacing w:before="20" w:after="20"/>
+      </w:pPr>
+      <w:r>
+        <w:t>Inserisci la quantità ricevuta → aggiungi nota opzionale → Salva</w:t>
+      </w:r>
+    </w:p>
+    <w:p>
+      <w:pPr>
+        <w:spacing w:after="80"/>
+      </w:pPr>
+      <w:r>
+        <w:t>Risultato: scorta precedente + quantità inserita.</w:t>
       </w:r>
     </w:p>
     <w:p>
@@ -626,28 +337,19 @@
         <w:t xml:space="preserve">Suggerimento: </w:t>
       </w:r>
       <w:r>
-        <w:t>Fai i carichi all'inizio della serata, prima di aprire la cassa, così le scorte sono subito aggiornate.</w:t>
-      </w:r>
-    </w:p>
-    <w:p>
-      <w:r>
-        <w:br w:type="page"/>
-      </w:r>
-    </w:p>
-    <w:p>
-      <w:pPr>
-        <w:pStyle w:val="Heading10"/>
-      </w:pPr>
-      <w:r>
-        <w:t>4. Rettificare le scorte dopo un conteggio fisico (Rettifica =)</w:t>
-      </w:r>
-    </w:p>
-    <w:p>
-      <w:pPr>
-        <w:spacing w:after="120"/>
-      </w:pPr>
-      <w:r>
-        <w:t>Usa la rettifica quando vuoi impostare la scorta a un valore esatto dopo aver contato fisicamente la merce. La rettifica sovrascrive la scorta attuale.</w:t>
+        <w:t>Fai i carichi a inizio serata, prima di aprire la cassa.</w:t>
+      </w:r>
+    </w:p>
+    <w:p>
+      <w:pPr>
+        <w:pStyle w:val="Heading20"/>
+        <w:pBdr>
+          <w:bottom w:val="single" w:sz="4" w:space="4" w:color="D97706"/>
+        </w:pBdr>
+        <w:spacing w:before="100" w:after="40"/>
+      </w:pPr>
+      <w:r>
+        <w:t>Rettifica = (conteggio fisico)</w:t>
       </w:r>
     </w:p>
     <w:p>
@@ -657,10 +359,10 @@
           <w:ilvl w:val="0"/>
           <w:numId w:val="3"/>
         </w:numPr>
-        <w:spacing w:before="40" w:after="40"/>
-      </w:pPr>
-      <w:r>
-        <w:t>Vai in Magazzino</w:t>
+        <w:spacing w:before="20" w:after="20"/>
+      </w:pPr>
+      <w:r>
+        <w:t>Magazzino → trova prodotto → Rettifica (=)</w:t>
       </w:r>
     </w:p>
     <w:p>
@@ -670,70 +372,18 @@
           <w:ilvl w:val="0"/>
           <w:numId w:val="3"/>
         </w:numPr>
-        <w:spacing w:before="40" w:after="40"/>
-      </w:pPr>
-      <w:r>
-        <w:t>Trova il prodotto da rettificare</w:t>
-      </w:r>
-    </w:p>
-    <w:p>
-      <w:pPr>
-        <w:pStyle w:val="Paragrafoelenco"/>
-        <w:numPr>
-          <w:ilvl w:val="0"/>
-          <w:numId w:val="3"/>
-        </w:numPr>
-        <w:spacing w:before="40" w:after="40"/>
-      </w:pPr>
-      <w:r>
-        <w:t>Clicca il pulsante Rettifica (=)</w:t>
-      </w:r>
-    </w:p>
-    <w:p>
-      <w:pPr>
-        <w:pStyle w:val="Paragrafoelenco"/>
-        <w:numPr>
-          <w:ilvl w:val="0"/>
-          <w:numId w:val="3"/>
-        </w:numPr>
-        <w:spacing w:before="40" w:after="40"/>
-      </w:pPr>
-      <w:r>
-        <w:t>Inserisci il valore contato fisicamente (es. 23)</w:t>
-      </w:r>
-    </w:p>
-    <w:p>
-      <w:pPr>
-        <w:pStyle w:val="Paragrafoelenco"/>
-        <w:numPr>
-          <w:ilvl w:val="0"/>
-          <w:numId w:val="3"/>
-        </w:numPr>
-        <w:spacing w:before="40" w:after="40"/>
-      </w:pPr>
-      <w:r>
-        <w:t>Aggiungi una nota (es. "Conteggio fisico 15/05")</w:t>
-      </w:r>
-    </w:p>
-    <w:p>
-      <w:pPr>
-        <w:pStyle w:val="Paragrafoelenco"/>
-        <w:numPr>
-          <w:ilvl w:val="0"/>
-          <w:numId w:val="3"/>
-        </w:numPr>
-        <w:spacing w:before="40" w:after="40"/>
-      </w:pPr>
-      <w:r>
-        <w:t>Clicca Salva</w:t>
-      </w:r>
-    </w:p>
-    <w:p>
-      <w:pPr>
-        <w:spacing w:after="120"/>
-      </w:pPr>
-      <w:r>
-        <w:t>La scorta viene impostata esattamente al valore inserito, indipendentemente da quella precedente.</w:t>
+        <w:spacing w:before="20" w:after="20"/>
+      </w:pPr>
+      <w:r>
+        <w:t>Inserisci il valore contato fisicamente → aggiungi nota → Salva</w:t>
+      </w:r>
+    </w:p>
+    <w:p>
+      <w:pPr>
+        <w:spacing w:after="80"/>
+      </w:pPr>
+      <w:r>
+        <w:t>Risultato: la scorta viene sovrascritta con il valore inserito.</w:t>
       </w:r>
     </w:p>
     <w:p>
@@ -753,28 +403,24 @@
         <w:t xml:space="preserve">Attenzione: </w:t>
       </w:r>
       <w:r>
-        <w:t>La rettifica sovrascrive il valore attuale. Usala solo dopo un conteggio fisico accurato.</w:t>
-      </w:r>
-    </w:p>
-    <w:p>
-      <w:r>
-        <w:br w:type="page"/>
+        <w:t>La rettifica sovrascrive il valore attuale — usala solo dopo un conteggio fisico.</w:t>
       </w:r>
     </w:p>
     <w:p>
       <w:pPr>
         <w:pStyle w:val="Heading10"/>
-      </w:pPr>
-      <w:r>
-        <w:t>5. Magazzini comuni</w:t>
-      </w:r>
-    </w:p>
-    <w:p>
-      <w:pPr>
-        <w:spacing w:after="120"/>
-      </w:pPr>
-      <w:r>
-        <w:t>Un magazzino comune permette a più prodotti di condividere lo stesso stock. Utile quando prodotti diversi usano lo stesso ingrediente principale (es. "panino" usato da Hamburger, Hamburger bacon, Hamburger vegetariano).</w:t>
+        <w:spacing w:before="160" w:after="60"/>
+      </w:pPr>
+      <w:r>
+        <w:t>3. Magazzini comuni</w:t>
+      </w:r>
+    </w:p>
+    <w:p>
+      <w:pPr>
+        <w:spacing w:after="80"/>
+      </w:pPr>
+      <w:r>
+        <w:t>Permettono a più prodotti di condividere lo stesso stock (es. "Panini" usato da Hamburger, Hamburger bacon, Veggie burger).</w:t>
       </w:r>
     </w:p>
     <w:p>
@@ -783,6 +429,7 @@
         <w:pBdr>
           <w:bottom w:val="single" w:sz="4" w:space="4" w:color="D97706"/>
         </w:pBdr>
+        <w:spacing w:before="100" w:after="40"/>
       </w:pPr>
       <w:r>
         <w:t>Creare un magazzino comune</w:t>
@@ -795,10 +442,22 @@
           <w:ilvl w:val="0"/>
           <w:numId w:val="3"/>
         </w:numPr>
-        <w:spacing w:before="40" w:after="40"/>
-      </w:pPr>
-      <w:r>
-        <w:t>Vai su Setup → Magazzini comuni</w:t>
+        <w:spacing w:before="20" w:after="20"/>
+      </w:pPr>
+      <w:r>
+        <w:t>Setup → Magazzini comuni → Nuovo → inserisci nome e scorta iniziale → Salva</w:t>
+      </w:r>
+    </w:p>
+    <w:p>
+      <w:pPr>
+        <w:pStyle w:val="Heading20"/>
+        <w:pBdr>
+          <w:bottom w:val="single" w:sz="4" w:space="4" w:color="D97706"/>
+        </w:pBdr>
+        <w:spacing w:before="100" w:after="40"/>
+      </w:pPr>
+      <w:r>
+        <w:t>Collegare un prodotto</w:t>
       </w:r>
     </w:p>
     <w:p>
@@ -808,36 +467,27 @@
           <w:ilvl w:val="0"/>
           <w:numId w:val="3"/>
         </w:numPr>
-        <w:spacing w:before="40" w:after="40"/>
-      </w:pPr>
-      <w:r>
-        <w:t>Clicca Nuovo magazzino comune</w:t>
-      </w:r>
-    </w:p>
-    <w:p>
-      <w:pPr>
-        <w:pStyle w:val="Paragrafoelenco"/>
-        <w:numPr>
-          <w:ilvl w:val="0"/>
-          <w:numId w:val="3"/>
-        </w:numPr>
-        <w:spacing w:before="40" w:after="40"/>
-      </w:pPr>
-      <w:r>
-        <w:t>Inserisci il nome (es. "Panini") e la scorta iniziale</w:t>
-      </w:r>
-    </w:p>
-    <w:p>
-      <w:pPr>
-        <w:pStyle w:val="Paragrafoelenco"/>
-        <w:numPr>
-          <w:ilvl w:val="0"/>
-          <w:numId w:val="3"/>
-        </w:numPr>
-        <w:spacing w:before="40" w:after="40"/>
-      </w:pPr>
-      <w:r>
-        <w:t>Salva</w:t>
+        <w:spacing w:before="20" w:after="20"/>
+      </w:pPr>
+      <w:r>
+        <w:t>Setup → Prodotti → seleziona prodotto → campo Magazzino comune → Salva</w:t>
+      </w:r>
+    </w:p>
+    <w:p>
+      <w:pPr>
+        <w:spacing w:after="80"/>
+      </w:pPr>
+      <w:r>
+        <w:t>Ogni vendita del prodotto scarica il magazzino comune, non la scorta singola.</w:t>
+      </w:r>
+    </w:p>
+    <w:p>
+      <w:pPr>
+        <w:pStyle w:val="Heading10"/>
+        <w:spacing w:before="160" w:after="60"/>
+      </w:pPr>
+      <w:r>
+        <w:t>4. Movimenti e allarmi scorte</w:t>
       </w:r>
     </w:p>
     <w:p>
@@ -846,69 +496,18 @@
         <w:pBdr>
           <w:bottom w:val="single" w:sz="4" w:space="4" w:color="D97706"/>
         </w:pBdr>
-      </w:pPr>
-      <w:r>
-        <w:t>Collegare un prodotto al magazzino comune</w:t>
-      </w:r>
-    </w:p>
-    <w:p>
-      <w:pPr>
-        <w:pStyle w:val="Paragrafoelenco"/>
-        <w:numPr>
-          <w:ilvl w:val="0"/>
-          <w:numId w:val="3"/>
-        </w:numPr>
-        <w:spacing w:before="40" w:after="40"/>
-      </w:pPr>
-      <w:r>
-        <w:t>Vai su Setup → Prodotti</w:t>
-      </w:r>
-    </w:p>
-    <w:p>
-      <w:pPr>
-        <w:pStyle w:val="Paragrafoelenco"/>
-        <w:numPr>
-          <w:ilvl w:val="0"/>
-          <w:numId w:val="3"/>
-        </w:numPr>
-        <w:spacing w:before="40" w:after="40"/>
-      </w:pPr>
-      <w:r>
-        <w:t>Seleziona il prodotto</w:t>
-      </w:r>
-    </w:p>
-    <w:p>
-      <w:pPr>
-        <w:pStyle w:val="Paragrafoelenco"/>
-        <w:numPr>
-          <w:ilvl w:val="0"/>
-          <w:numId w:val="3"/>
-        </w:numPr>
-        <w:spacing w:before="40" w:after="40"/>
-      </w:pPr>
-      <w:r>
-        <w:t>Nel campo Magazzino comune seleziona il magazzino creato</w:t>
-      </w:r>
-    </w:p>
-    <w:p>
-      <w:pPr>
-        <w:pStyle w:val="Paragrafoelenco"/>
-        <w:numPr>
-          <w:ilvl w:val="0"/>
-          <w:numId w:val="3"/>
-        </w:numPr>
-        <w:spacing w:before="40" w:after="40"/>
-      </w:pPr>
-      <w:r>
-        <w:t>Salva</w:t>
-      </w:r>
-    </w:p>
-    <w:p>
-      <w:pPr>
-        <w:spacing w:after="120"/>
-      </w:pPr>
-      <w:r>
-        <w:t>Da questo momento ogni vendita del prodotto scarica il magazzino comune, non la scorta del singolo prodotto.</w:t>
+        <w:spacing w:before="100" w:after="40"/>
+      </w:pPr>
+      <w:r>
+        <w:t>Registro movimenti</w:t>
+      </w:r>
+    </w:p>
+    <w:p>
+      <w:pPr>
+        <w:spacing w:after="80"/>
+      </w:pPr>
+      <w:r>
+        <w:t>La scheda Movimenti mostra la cronologia completa: tipo (vendita, carico, rettifica, storno), quantità variata, scorta risultante, nota.</w:t>
       </w:r>
     </w:p>
     <w:p>
@@ -928,364 +527,27 @@
         <w:t xml:space="preserve">Suggerimento: </w:t>
       </w:r>
       <w:r>
-        <w:t>Puoi collegare quanti prodotti vuoi allo stesso magazzino comune. Le scorte si scalano tutte dallo stesso contatore.</w:t>
-      </w:r>
-    </w:p>
-    <w:p>
-      <w:r>
-        <w:br w:type="page"/>
-      </w:r>
-    </w:p>
-    <w:p>
-      <w:pPr>
-        <w:pStyle w:val="Heading10"/>
-      </w:pPr>
-      <w:r>
-        <w:t>6. Leggere il registro movimenti</w:t>
-      </w:r>
-    </w:p>
-    <w:p>
-      <w:pPr>
-        <w:spacing w:after="120"/>
-      </w:pPr>
-      <w:r>
-        <w:t>La scheda Movimenti mostra la cronologia completa di tutti i cambi di scorta.</w:t>
-      </w:r>
-    </w:p>
-    <w:tbl>
-      <w:tblPr>
-        <w:tblW w:w="9360" w:type="dxa"/>
-        <w:tblInd w:w="130" w:type="dxa"/>
-        <w:tblBorders>
-          <w:top w:val="single" w:sz="4" w:space="0" w:color="auto"/>
-          <w:left w:val="single" w:sz="4" w:space="0" w:color="auto"/>
-          <w:bottom w:val="single" w:sz="4" w:space="0" w:color="auto"/>
-          <w:right w:val="single" w:sz="4" w:space="0" w:color="auto"/>
-          <w:insideH w:val="single" w:sz="4" w:space="0" w:color="auto"/>
-          <w:insideV w:val="single" w:sz="4" w:space="0" w:color="auto"/>
-        </w:tblBorders>
-        <w:tblCellMar>
-          <w:left w:w="10" w:type="dxa"/>
-          <w:right w:w="10" w:type="dxa"/>
-        </w:tblCellMar>
-        <w:tblLook w:val="04A0"/>
-      </w:tblPr>
-      <w:tblGrid>
-        <w:gridCol w:w="3500"/>
-        <w:gridCol w:w="5860"/>
-      </w:tblGrid>
-      <w:tr>
-        <w:tblPrEx>
-          <w:tblCellMar>
-            <w:top w:w="0" w:type="dxa"/>
-            <w:bottom w:w="0" w:type="dxa"/>
-          </w:tblCellMar>
-        </w:tblPrEx>
-        <w:tc>
-          <w:tcPr>
-            <w:tcW w:w="3500" w:type="dxa"/>
-            <w:tcBorders>
-              <w:top w:val="single" w:sz="1" w:space="0" w:color="CCCCCC"/>
-              <w:left w:val="single" w:sz="1" w:space="0" w:color="CCCCCC"/>
-              <w:bottom w:val="single" w:sz="1" w:space="0" w:color="CCCCCC"/>
-              <w:right w:val="single" w:sz="1" w:space="0" w:color="CCCCCC"/>
-            </w:tcBorders>
-            <w:shd w:val="clear" w:color="auto" w:fill="F5F5F5"/>
-            <w:tcMar>
-              <w:top w:w="80" w:type="dxa"/>
-              <w:left w:w="140" w:type="dxa"/>
-              <w:bottom w:w="80" w:type="dxa"/>
-              <w:right w:w="140" w:type="dxa"/>
-            </w:tcMar>
-          </w:tcPr>
-          <w:p>
-            <w:r>
-              <w:rPr>
-                <w:b/>
-              </w:rPr>
-              <w:t>Colonna</w:t>
-            </w:r>
-          </w:p>
-        </w:tc>
-        <w:tc>
-          <w:tcPr>
-            <w:tcW w:w="5860" w:type="dxa"/>
-            <w:tcBorders>
-              <w:top w:val="single" w:sz="1" w:space="0" w:color="CCCCCC"/>
-              <w:left w:val="single" w:sz="1" w:space="0" w:color="CCCCCC"/>
-              <w:bottom w:val="single" w:sz="1" w:space="0" w:color="CCCCCC"/>
-              <w:right w:val="single" w:sz="1" w:space="0" w:color="CCCCCC"/>
-            </w:tcBorders>
-            <w:shd w:val="clear" w:color="auto" w:fill="F5F5F5"/>
-            <w:tcMar>
-              <w:top w:w="80" w:type="dxa"/>
-              <w:left w:w="140" w:type="dxa"/>
-              <w:bottom w:w="80" w:type="dxa"/>
-              <w:right w:w="140" w:type="dxa"/>
-            </w:tcMar>
-          </w:tcPr>
-          <w:p>
-            <w:r>
-              <w:rPr>
-                <w:b/>
-              </w:rPr>
-              <w:t>Significato</w:t>
-            </w:r>
-          </w:p>
-        </w:tc>
-      </w:tr>
-      <w:tr>
-        <w:tc>
-          <w:tcPr>
-            <w:tcW w:type="dxa" w:w="3500"/>
-          </w:tcPr>
-          <w:p>
-            <w:r>
-              <w:t>Data/ora</w:t>
-            </w:r>
-          </w:p>
-        </w:tc>
-        <w:tc>
-          <w:tcPr>
-            <w:tcW w:type="dxa" w:w="5860"/>
-          </w:tcPr>
-          <w:p>
-            <w:r>
-              <w:t>Quando è avvenuto il movimento</w:t>
-            </w:r>
-          </w:p>
-        </w:tc>
-      </w:tr>
-      <w:tr>
-        <w:tc>
-          <w:tcPr>
-            <w:tcW w:type="dxa" w:w="3500"/>
-          </w:tcPr>
-          <w:p>
-            <w:r>
-              <w:t>Prodotto</w:t>
-            </w:r>
-          </w:p>
-        </w:tc>
-        <w:tc>
-          <w:tcPr>
-            <w:tcW w:type="dxa" w:w="5860"/>
-          </w:tcPr>
-          <w:p>
-            <w:r>
-              <w:t>Prodotto o magazzino comune interessato</w:t>
-            </w:r>
-          </w:p>
-        </w:tc>
-      </w:tr>
-      <w:tr>
-        <w:tc>
-          <w:tcPr>
-            <w:tcW w:type="dxa" w:w="3500"/>
-          </w:tcPr>
-          <w:p>
-            <w:r>
-              <w:t>Tipo</w:t>
-            </w:r>
-          </w:p>
-        </w:tc>
-        <w:tc>
-          <w:tcPr>
-            <w:tcW w:type="dxa" w:w="5860"/>
-          </w:tcPr>
-          <w:p>
-            <w:r>
-              <w:t>Vendita (scarico automatico), Carico, Rettifica, Storno</w:t>
-            </w:r>
-          </w:p>
-        </w:tc>
-      </w:tr>
-      <w:tr>
-        <w:tc>
-          <w:tcPr>
-            <w:tcW w:type="dxa" w:w="3500"/>
-          </w:tcPr>
-          <w:p>
-            <w:r>
-              <w:t>Quantità</w:t>
-            </w:r>
-          </w:p>
-        </w:tc>
-        <w:tc>
-          <w:tcPr>
-            <w:tcW w:type="dxa" w:w="5860"/>
-          </w:tcPr>
-          <w:p>
-            <w:r>
-              <w:t>Variazione: negativa per scarichi, positiva per carichi</w:t>
-            </w:r>
-          </w:p>
-        </w:tc>
-      </w:tr>
-      <w:tr>
-        <w:tc>
-          <w:tcPr>
-            <w:tcW w:type="dxa" w:w="3500"/>
-          </w:tcPr>
-          <w:p>
-            <w:r>
-              <w:t>Scorta dopo</w:t>
-            </w:r>
-          </w:p>
-        </w:tc>
-        <w:tc>
-          <w:tcPr>
-            <w:tcW w:type="dxa" w:w="5860"/>
-          </w:tcPr>
-          <w:p>
-            <w:r>
-              <w:t>Scorta risultante dopo il movimento</w:t>
-            </w:r>
-          </w:p>
-        </w:tc>
-      </w:tr>
-      <w:tr>
-        <w:tc>
-          <w:tcPr>
-            <w:tcW w:type="dxa" w:w="3500"/>
-          </w:tcPr>
-          <w:p>
-            <w:r>
-              <w:t>Note</w:t>
-            </w:r>
-          </w:p>
-        </w:tc>
-        <w:tc>
-          <w:tcPr>
-            <w:tcW w:type="dxa" w:w="5860"/>
-          </w:tcPr>
-          <w:p>
-            <w:r>
-              <w:t>Eventuale nota manuale (per carichi e rettifiche)</w:t>
-            </w:r>
-          </w:p>
-        </w:tc>
-      </w:tr>
-    </w:tbl>
-    <w:p>
-      <w:pPr>
+        <w:t>Filtra per prodotto per capire perché una scorta non torna.</w:t>
+      </w:r>
+    </w:p>
+    <w:p>
+      <w:pPr>
+        <w:pStyle w:val="Heading20"/>
         <w:pBdr>
-          <w:left w:val="single" w:sz="12" w:space="8" w:color="16A34A"/>
+          <w:bottom w:val="single" w:sz="4" w:space="4" w:color="D97706"/>
         </w:pBdr>
-        <w:shd w:val="clear" w:color="auto" w:fill="F0FDF4"/>
-        <w:spacing w:before="100" w:after="100"/>
-        <w:ind w:left="200"/>
-      </w:pPr>
-      <w:r>
-        <w:rPr>
-          <w:b/>
-          <w:color w:val="16A34A"/>
-        </w:rPr>
-        <w:t xml:space="preserve">Suggerimento: </w:t>
-      </w:r>
-      <w:r>
-        <w:t>Usa il registro movimenti per verificare perché la scorta di un prodotto non corrisponde alle aspettative. Filtra per prodotto per vedere solo i suoi movimenti.</w:t>
-      </w:r>
-    </w:p>
-    <w:p>
-      <w:r>
-        <w:br w:type="page"/>
-      </w:r>
-    </w:p>
-    <w:p>
-      <w:pPr>
-        <w:pStyle w:val="Heading10"/>
-      </w:pPr>
-      <w:r>
-        <w:t>7. Allarmi scorte basse</w:t>
-      </w:r>
-    </w:p>
-    <w:p>
-      <w:pPr>
-        <w:spacing w:after="120"/>
-      </w:pPr>
-      <w:r>
-        <w:t>Ogni prodotto ha una soglia di allarme configurabile in Setup → Prodotti. Quando la scorta scende sotto la soglia, il prodotto viene segnalato nella pagina Magazzino.</w:t>
-      </w:r>
-    </w:p>
-    <w:p>
-      <w:pPr>
-        <w:pStyle w:val="Paragrafoelenco"/>
-        <w:numPr>
-          <w:ilvl w:val="0"/>
-          <w:numId w:val="3"/>
-        </w:numPr>
-        <w:spacing w:before="40" w:after="40"/>
-      </w:pPr>
-      <w:r>
-        <w:t>Vai su Setup → Prodotti</w:t>
-      </w:r>
-    </w:p>
-    <w:p>
-      <w:pPr>
-        <w:pStyle w:val="Paragrafoelenco"/>
-        <w:numPr>
-          <w:ilvl w:val="0"/>
-          <w:numId w:val="3"/>
-        </w:numPr>
-        <w:spacing w:before="40" w:after="40"/>
-      </w:pPr>
-      <w:r>
-        <w:t>Seleziona il prodotto</w:t>
-      </w:r>
-    </w:p>
-    <w:p>
-      <w:pPr>
-        <w:pStyle w:val="Paragrafoelenco"/>
-        <w:numPr>
-          <w:ilvl w:val="0"/>
-          <w:numId w:val="3"/>
-        </w:numPr>
-        <w:spacing w:before="40" w:after="40"/>
-      </w:pPr>
-      <w:r>
-        <w:t>Imposta il campo Soglia allarme (es. 10)</w:t>
-      </w:r>
-    </w:p>
-    <w:p>
-      <w:pPr>
-        <w:pStyle w:val="Paragrafoelenco"/>
-        <w:numPr>
-          <w:ilvl w:val="0"/>
-          <w:numId w:val="3"/>
-        </w:numPr>
-        <w:spacing w:before="40" w:after="40"/>
-      </w:pPr>
-      <w:r>
-        <w:t>Salva</w:t>
-      </w:r>
-    </w:p>
-    <w:p>
-      <w:pPr>
-        <w:spacing w:after="120"/>
-      </w:pPr>
-      <w:r>
-        <w:t>Quando la scorta scende sotto la soglia, il prodotto appare evidenziato nella scheda Prodotti singoli o Magazzini comuni.</w:t>
-      </w:r>
-    </w:p>
-    <w:p>
-      <w:pPr>
-        <w:pBdr>
-          <w:left w:val="single" w:sz="12" w:space="8" w:color="16A34A"/>
-        </w:pBdr>
-        <w:shd w:val="clear" w:color="auto" w:fill="F0FDF4"/>
-        <w:spacing w:before="100" w:after="100"/>
-        <w:ind w:left="200"/>
-      </w:pPr>
-      <w:r>
-        <w:rPr>
-          <w:b/>
-          <w:color w:val="16A34A"/>
-        </w:rPr>
-        <w:t xml:space="preserve">Suggerimento: </w:t>
-      </w:r>
-      <w:r>
-        <w:t>Imposta la soglia di allarme a un valore che ti dia il tempo di ricaricare prima di esaurire le scorte. Per un prodotto che vendi 20 unità a serata, una soglia di 15 ti avvisa quando hai ancora quasi una serata di scorte.</w:t>
+        <w:spacing w:before="100" w:after="40"/>
+      </w:pPr>
+      <w:r>
+        <w:t>Allarmi scorte basse</w:t>
+      </w:r>
+    </w:p>
+    <w:p>
+      <w:pPr>
+        <w:spacing w:after="80"/>
+      </w:pPr>
+      <w:r>
+        <w:t>Configura la soglia in Setup → Prodotti → campo Soglia allarme. Quando la scorta scende sotto soglia, il prodotto appare evidenziato nella pagina Magazzino.</w:t>
       </w:r>
     </w:p>
   </w:body>

</xml_diff>

<commit_message>
Rimuove registro movimenti: frontend e guide aggiornati
- Magazzino.jsx: rimossa tab Movimenti, stato e fetch movimenti_magazzino
- Guida magazzino: sezione 4 diventa solo allarmi scorte basse
- Nota allarme aggiornata: menziona l'animazione in cassa

Co-Authored-By: Claude Sonnet 4.6 <noreply@anthropic.com>
</commit_message>
<xml_diff>
--- a/guide/Guida_Rapida_Magazzino.docx
+++ b/guide/Guida_Rapida_Magazzino.docx
@@ -487,19 +487,7 @@
         <w:spacing w:before="160" w:after="60"/>
       </w:pPr>
       <w:r>
-        <w:t>4. Movimenti e allarmi scorte</w:t>
-      </w:r>
-    </w:p>
-    <w:p>
-      <w:pPr>
-        <w:pStyle w:val="Heading20"/>
-        <w:pBdr>
-          <w:bottom w:val="single" w:sz="4" w:space="4" w:color="D97706"/>
-        </w:pBdr>
-        <w:spacing w:before="100" w:after="40"/>
-      </w:pPr>
-      <w:r>
-        <w:t>Registro movimenti</w:t>
+        <w:t>4. Allarmi scorte basse</w:t>
       </w:r>
     </w:p>
     <w:p>
@@ -507,47 +495,7 @@
         <w:spacing w:after="80"/>
       </w:pPr>
       <w:r>
-        <w:t>La scheda Movimenti mostra la cronologia completa: tipo (vendita, carico, rettifica, storno), quantità variata, scorta risultante, nota.</w:t>
-      </w:r>
-    </w:p>
-    <w:p>
-      <w:pPr>
-        <w:pBdr>
-          <w:left w:val="single" w:sz="12" w:space="8" w:color="16A34A"/>
-        </w:pBdr>
-        <w:shd w:val="clear" w:color="auto" w:fill="F0FDF4"/>
-        <w:spacing w:before="100" w:after="100"/>
-        <w:ind w:left="200"/>
-      </w:pPr>
-      <w:r>
-        <w:rPr>
-          <w:b/>
-          <w:color w:val="16A34A"/>
-        </w:rPr>
-        <w:t xml:space="preserve">Suggerimento: </w:t>
-      </w:r>
-      <w:r>
-        <w:t>Filtra per prodotto per capire perché una scorta non torna.</w:t>
-      </w:r>
-    </w:p>
-    <w:p>
-      <w:pPr>
-        <w:pStyle w:val="Heading20"/>
-        <w:pBdr>
-          <w:bottom w:val="single" w:sz="4" w:space="4" w:color="D97706"/>
-        </w:pBdr>
-        <w:spacing w:before="100" w:after="40"/>
-      </w:pPr>
-      <w:r>
-        <w:t>Allarmi scorte basse</w:t>
-      </w:r>
-    </w:p>
-    <w:p>
-      <w:pPr>
-        <w:spacing w:after="80"/>
-      </w:pPr>
-      <w:r>
-        <w:t>Configura la soglia in Setup → Prodotti → campo Soglia allarme. Quando la scorta scende sotto soglia, il prodotto appare evidenziato nella pagina Magazzino.</w:t>
+        <w:t>Configura la soglia in Setup → Prodotti → campo Soglia allarme. Quando la scorta scende sotto soglia, il prodotto appare evidenziato nella pagina Magazzino e il bottone in cassa lampeggia con un alone rosso.</w:t>
       </w:r>
     </w:p>
   </w:body>

</xml_diff>